<commit_message>
Update CV to include personal portfolio link
</commit_message>
<xml_diff>
--- a/Kundai_Nelly_Semu_CV.docx
+++ b/Kundai_Nelly_Semu_CV.docx
@@ -27,21 +27,7 @@
           <w:rFonts w:ascii="Calibri" w:eastAsia="Calibri" w:hAnsi="Calibri" w:cs="Calibri"/>
           <w:color w:val="444444"/>
         </w:rPr>
-        <w:t>East London</w:t>
-      </w:r>
-      <w:r>
-        <w:rPr>
-          <w:rFonts w:ascii="Calibri" w:eastAsia="Calibri" w:hAnsi="Calibri" w:cs="Calibri"/>
-          <w:color w:val="444444"/>
-        </w:rPr>
-        <w:t xml:space="preserve">, </w:t>
-      </w:r>
-      <w:r>
-        <w:rPr>
-          <w:rFonts w:ascii="Calibri" w:eastAsia="Calibri" w:hAnsi="Calibri" w:cs="Calibri"/>
-          <w:color w:val="444444"/>
-        </w:rPr>
-        <w:t xml:space="preserve">South </w:t>
+        <w:t xml:space="preserve">East London, South </w:t>
       </w:r>
       <w:proofErr w:type="gramStart"/>
       <w:r>
@@ -49,14 +35,7 @@
           <w:rFonts w:ascii="Calibri" w:eastAsia="Calibri" w:hAnsi="Calibri" w:cs="Calibri"/>
           <w:color w:val="444444"/>
         </w:rPr>
-        <w:t>Africa</w:t>
-      </w:r>
-      <w:r>
-        <w:rPr>
-          <w:rFonts w:ascii="Calibri" w:eastAsia="Calibri" w:hAnsi="Calibri" w:cs="Calibri"/>
-          <w:color w:val="444444"/>
-        </w:rPr>
-        <w:t xml:space="preserve">  |</w:t>
+        <w:t>Africa  |</w:t>
       </w:r>
       <w:proofErr w:type="gramEnd"/>
       <w:r>
@@ -64,31 +43,15 @@
           <w:rFonts w:ascii="Calibri" w:eastAsia="Calibri" w:hAnsi="Calibri" w:cs="Calibri"/>
           <w:color w:val="444444"/>
         </w:rPr>
-        <w:t xml:space="preserve">  </w:t>
-      </w:r>
-      <w:r>
-        <w:rPr>
-          <w:rFonts w:ascii="Calibri" w:eastAsia="Calibri" w:hAnsi="Calibri" w:cs="Calibri"/>
-          <w:color w:val="444444"/>
-        </w:rPr>
-        <w:t xml:space="preserve">+27 67 144 </w:t>
-      </w:r>
-      <w:proofErr w:type="gramStart"/>
-      <w:r>
-        <w:rPr>
-          <w:rFonts w:ascii="Calibri" w:eastAsia="Calibri" w:hAnsi="Calibri" w:cs="Calibri"/>
-          <w:color w:val="444444"/>
-        </w:rPr>
-        <w:t>9523</w:t>
-      </w:r>
-      <w:r>
-        <w:rPr>
-          <w:rFonts w:ascii="Calibri" w:eastAsia="Calibri" w:hAnsi="Calibri" w:cs="Calibri"/>
-          <w:color w:val="444444"/>
-        </w:rPr>
-        <w:t xml:space="preserve">  |</w:t>
-      </w:r>
-      <w:proofErr w:type="gramEnd"/>
+        <w:t xml:space="preserve">  +27 67 144 </w:t>
+      </w:r>
+      <w:r>
+        <w:rPr>
+          <w:rFonts w:ascii="Calibri" w:eastAsia="Calibri" w:hAnsi="Calibri" w:cs="Calibri"/>
+          <w:color w:val="444444"/>
+        </w:rPr>
+        <w:t>9523 |</w:t>
+      </w:r>
       <w:r>
         <w:rPr>
           <w:rFonts w:ascii="Calibri" w:eastAsia="Calibri" w:hAnsi="Calibri" w:cs="Calibri"/>
@@ -118,21 +81,7 @@
             <w:rStyle w:val="Hyperlink"/>
             <w:rFonts w:ascii="Calibri" w:eastAsia="Calibri" w:hAnsi="Calibri" w:cs="Calibri"/>
           </w:rPr>
-          <w:t>linkedin</w:t>
-        </w:r>
-        <w:r>
-          <w:rPr>
-            <w:rStyle w:val="Hyperlink"/>
-            <w:rFonts w:ascii="Calibri" w:eastAsia="Calibri" w:hAnsi="Calibri" w:cs="Calibri"/>
-          </w:rPr>
-          <w:t>.</w:t>
-        </w:r>
-        <w:r>
-          <w:rPr>
-            <w:rStyle w:val="Hyperlink"/>
-            <w:rFonts w:ascii="Calibri" w:eastAsia="Calibri" w:hAnsi="Calibri" w:cs="Calibri"/>
-          </w:rPr>
-          <w:t xml:space="preserve">com/in/kundai-nelly-semu-63775a245 </w:t>
+          <w:t xml:space="preserve">linkedin.com/in/kundai-nelly-semu-63775a245 </w:t>
         </w:r>
       </w:hyperlink>
       <w:r>
@@ -140,21 +89,7 @@
           <w:rFonts w:ascii="Calibri" w:eastAsia="Calibri" w:hAnsi="Calibri" w:cs="Calibri"/>
           <w:color w:val="444444"/>
         </w:rPr>
-        <w:t xml:space="preserve"> </w:t>
-      </w:r>
-      <w:r>
-        <w:rPr>
-          <w:rFonts w:ascii="Calibri" w:eastAsia="Calibri" w:hAnsi="Calibri" w:cs="Calibri"/>
-          <w:color w:val="444444"/>
-        </w:rPr>
-        <w:t xml:space="preserve"> </w:t>
-      </w:r>
-      <w:r>
-        <w:rPr>
-          <w:rFonts w:ascii="Calibri" w:eastAsia="Calibri" w:hAnsi="Calibri" w:cs="Calibri"/>
-          <w:color w:val="444444"/>
-        </w:rPr>
-        <w:t xml:space="preserve">| </w:t>
+        <w:t xml:space="preserve">  | </w:t>
       </w:r>
       <w:hyperlink r:id="rId7" w:history="1">
         <w:r>
@@ -162,21 +97,32 @@
             <w:rStyle w:val="Hyperlink"/>
             <w:rFonts w:ascii="Calibri" w:eastAsia="Calibri" w:hAnsi="Calibri" w:cs="Calibri"/>
           </w:rPr>
-          <w:t>github.com</w:t>
+          <w:t>github.com/kundaisemu</w:t>
         </w:r>
+      </w:hyperlink>
+      <w:r>
+        <w:t xml:space="preserve"> </w:t>
+      </w:r>
+      <w:r>
+        <w:rPr>
+          <w:b/>
+          <w:bCs/>
+        </w:rPr>
+        <w:t>|</w:t>
+      </w:r>
+      <w:r>
+        <w:rPr>
+          <w:b/>
+          <w:bCs/>
+        </w:rPr>
+        <w:t xml:space="preserve"> </w:t>
+      </w:r>
+      <w:hyperlink r:id="rId8" w:history="1">
         <w:r>
           <w:rPr>
             <w:rStyle w:val="Hyperlink"/>
-            <w:rFonts w:ascii="Calibri" w:eastAsia="Calibri" w:hAnsi="Calibri" w:cs="Calibri"/>
           </w:rPr>
-          <w:t>/</w:t>
-        </w:r>
-        <w:r>
-          <w:rPr>
-            <w:rStyle w:val="Hyperlink"/>
-            <w:rFonts w:ascii="Calibri" w:eastAsia="Calibri" w:hAnsi="Calibri" w:cs="Calibri"/>
-          </w:rPr>
-          <w:t>kundaisemu</w:t>
+          <w:t>https://kundai-nelly.github.io/portfolio/</w:t>
         </w:r>
       </w:hyperlink>
     </w:p>
@@ -1184,10 +1130,7 @@
         <w:br/>
       </w:r>
       <w:r>
-        <w:t>IITPSA Board confirmation of critical skills (2026</w:t>
-      </w:r>
-      <w:r>
-        <w:t xml:space="preserve">): </w:t>
+        <w:t xml:space="preserve">IITPSA Board confirmation of critical skills (2026): </w:t>
       </w:r>
     </w:p>
     <w:p>
@@ -1200,10 +1143,7 @@
         <w:spacing w:after="100"/>
       </w:pPr>
       <w:r>
-        <w:t>Data</w:t>
-      </w:r>
-      <w:r>
-        <w:t xml:space="preserve"> Analyst</w:t>
+        <w:t>Data Analyst</w:t>
       </w:r>
     </w:p>
     <w:p>
@@ -2019,6 +1959,7 @@
   <w:style w:type="character" w:default="1" w:styleId="DefaultParagraphFont">
     <w:name w:val="Default Paragraph Font"/>
     <w:uiPriority w:val="1"/>
+    <w:semiHidden/>
     <w:unhideWhenUsed/>
   </w:style>
   <w:style w:type="table" w:default="1" w:styleId="TableNormal">

</xml_diff>

<commit_message>
Update CV to enhance project descriptions and include direct links to GitHub and live applications
</commit_message>
<xml_diff>
--- a/Kundai_Nelly_Semu_CV.docx
+++ b/Kundai_Nelly_Semu_CV.docx
@@ -29,13 +29,27 @@
         </w:rPr>
         <w:t xml:space="preserve">East London, South </w:t>
       </w:r>
+      <w:r>
+        <w:rPr>
+          <w:rFonts w:ascii="Calibri" w:eastAsia="Calibri" w:hAnsi="Calibri" w:cs="Calibri"/>
+          <w:color w:val="444444"/>
+        </w:rPr>
+        <w:t xml:space="preserve">Africa </w:t>
+      </w:r>
       <w:proofErr w:type="gramStart"/>
       <w:r>
         <w:rPr>
           <w:rFonts w:ascii="Calibri" w:eastAsia="Calibri" w:hAnsi="Calibri" w:cs="Calibri"/>
           <w:color w:val="444444"/>
         </w:rPr>
-        <w:t>Africa  |</w:t>
+        <w:t>|</w:t>
+      </w:r>
+      <w:r>
+        <w:rPr>
+          <w:rFonts w:ascii="Calibri" w:eastAsia="Calibri" w:hAnsi="Calibri" w:cs="Calibri"/>
+          <w:color w:val="444444"/>
+        </w:rPr>
+        <w:t xml:space="preserve">  +</w:t>
       </w:r>
       <w:proofErr w:type="gramEnd"/>
       <w:r>
@@ -43,7 +57,7 @@
           <w:rFonts w:ascii="Calibri" w:eastAsia="Calibri" w:hAnsi="Calibri" w:cs="Calibri"/>
           <w:color w:val="444444"/>
         </w:rPr>
-        <w:t xml:space="preserve">  +27 67 144 </w:t>
+        <w:t xml:space="preserve">27 67 144 </w:t>
       </w:r>
       <w:r>
         <w:rPr>
@@ -91,6 +105,13 @@
         </w:rPr>
         <w:t xml:space="preserve">  | </w:t>
       </w:r>
+      <w:r>
+        <w:rPr>
+          <w:rFonts w:ascii="Calibri" w:eastAsia="Calibri" w:hAnsi="Calibri" w:cs="Calibri"/>
+          <w:color w:val="444444"/>
+        </w:rPr>
+        <w:t xml:space="preserve">GitHub: </w:t>
+      </w:r>
       <w:hyperlink r:id="rId7" w:history="1">
         <w:r>
           <w:rPr>
@@ -117,6 +138,18 @@
         </w:rPr>
         <w:t xml:space="preserve"> </w:t>
       </w:r>
+      <w:r>
+        <w:t>P</w:t>
+      </w:r>
+      <w:r>
+        <w:t>ortfoli</w:t>
+      </w:r>
+      <w:r>
+        <w:t>o</w:t>
+      </w:r>
+      <w:r>
+        <w:t xml:space="preserve">: </w:t>
+      </w:r>
       <w:hyperlink r:id="rId8" w:history="1">
         <w:r>
           <w:rPr>
@@ -156,7 +189,16 @@
           <w:sz w:val="22"/>
           <w:szCs w:val="22"/>
         </w:rPr>
-        <w:t>Systems engineer and data analyst based in Harare, with a background spanning database administration, business intelligence and applied machine learning. Core stack of Python, SQL, scikit-learn and XGBoost, with production experience keeping MySQL/PostgreSQL databases and Windows/Linux server estates running. Has independently built and shipped six end-to-end data science projects, from raw data through statistical validation to deployed Streamlit applications. Looking for data analyst, data scientist, or data-oriented systems roles.</w:t>
+        <w:t xml:space="preserve">Systems engineer and data analyst based in Harare, with a background spanning database administration, business intelligence and applied machine learning. Core stack of Python, SQL, scikit-learn and XGBoost, with production experience keeping MySQL/PostgreSQL databases and Windows/Linux server estates running. Has independently built and shipped six end-to-end data science projects, from raw data through statistical validation to deployed Streamlit applications. Looking for data analyst, data scientist, or </w:t>
+      </w:r>
+      <w:r>
+        <w:rPr>
+          <w:rFonts w:ascii="Calibri" w:eastAsia="Calibri" w:hAnsi="Calibri" w:cs="Calibri"/>
+          <w:color w:val="000000"/>
+          <w:sz w:val="22"/>
+          <w:szCs w:val="22"/>
+        </w:rPr>
+        <w:t>data-oriented systems roles.</w:t>
       </w:r>
     </w:p>
     <w:p>
@@ -588,7 +630,7 @@
     </w:p>
     <w:p>
       <w:pPr>
-        <w:spacing w:before="140" w:after="20"/>
+        <w:spacing w:before="140"/>
       </w:pPr>
       <w:r>
         <w:rPr>
@@ -604,6 +646,127 @@
     </w:p>
     <w:p>
       <w:pPr>
+        <w:ind w:left="200"/>
+      </w:pPr>
+      <w:r>
+        <w:rPr>
+          <w:rFonts w:ascii="Calibri" w:eastAsia="Calibri" w:hAnsi="Calibri" w:cs="Calibri"/>
+          <w:i/>
+          <w:iCs/>
+          <w:color w:val="444444"/>
+        </w:rPr>
+        <w:t xml:space="preserve">Description &amp; Architecture: </w:t>
+      </w:r>
+      <w:r>
+        <w:rPr>
+          <w:rFonts w:ascii="Calibri" w:eastAsia="Calibri" w:hAnsi="Calibri" w:cs="Calibri"/>
+          <w:color w:val="000000"/>
+        </w:rPr>
+        <w:t>Type 2 diabetes screening model on 10,000 patient records; identified and removed 16 post-diagnosis (leakage) columns before modelling.</w:t>
+      </w:r>
+    </w:p>
+    <w:p>
+      <w:pPr>
+        <w:ind w:left="200"/>
+      </w:pPr>
+      <w:r>
+        <w:rPr>
+          <w:rFonts w:ascii="Calibri" w:eastAsia="Calibri" w:hAnsi="Calibri" w:cs="Calibri"/>
+          <w:i/>
+          <w:iCs/>
+          <w:color w:val="444444"/>
+        </w:rPr>
+        <w:t xml:space="preserve">Core Tech Used: </w:t>
+      </w:r>
+      <w:r>
+        <w:rPr>
+          <w:rFonts w:ascii="Calibri" w:eastAsia="Calibri" w:hAnsi="Calibri" w:cs="Calibri"/>
+          <w:color w:val="000000"/>
+        </w:rPr>
+        <w:t>Python, pandas, XGBoost, SMOTE, Optuna, SHAP</w:t>
+      </w:r>
+    </w:p>
+    <w:p>
+      <w:pPr>
+        <w:ind w:left="200"/>
+      </w:pPr>
+      <w:r>
+        <w:rPr>
+          <w:rFonts w:ascii="Calibri" w:eastAsia="Calibri" w:hAnsi="Calibri" w:cs="Calibri"/>
+          <w:i/>
+          <w:iCs/>
+          <w:color w:val="444444"/>
+        </w:rPr>
+        <w:t xml:space="preserve">Direct Outcome: </w:t>
+      </w:r>
+      <w:r>
+        <w:rPr>
+          <w:rFonts w:ascii="Calibri" w:eastAsia="Calibri" w:hAnsi="Calibri" w:cs="Calibri"/>
+          <w:color w:val="000000"/>
+        </w:rPr>
+        <w:t xml:space="preserve">Reduced a leakage-inflated 1.000 AUC to a clinically defensible model; </w:t>
+      </w:r>
+      <w:r>
+        <w:rPr>
+          <w:rFonts w:ascii="Calibri" w:eastAsia="Calibri" w:hAnsi="Calibri" w:cs="Calibri"/>
+          <w:color w:val="000000"/>
+        </w:rPr>
+        <w:br/>
+        <w:t>GitHub</w:t>
+      </w:r>
+      <w:r>
+        <w:rPr>
+          <w:rFonts w:ascii="Calibri" w:eastAsia="Calibri" w:hAnsi="Calibri" w:cs="Calibri"/>
+          <w:color w:val="000000"/>
+        </w:rPr>
+        <w:t xml:space="preserve">: </w:t>
+      </w:r>
+      <w:hyperlink r:id="rId9" w:history="1">
+        <w:r>
+          <w:rPr>
+            <w:rStyle w:val="Hyperlink"/>
+            <w:rFonts w:ascii="Calibri" w:eastAsia="Calibri" w:hAnsi="Calibri" w:cs="Calibri"/>
+          </w:rPr>
+          <w:t>https://github.com/kundai-nelly/diabetes-risk-model</w:t>
+        </w:r>
+      </w:hyperlink>
+      <w:r>
+        <w:rPr>
+          <w:rFonts w:ascii="Calibri" w:eastAsia="Calibri" w:hAnsi="Calibri" w:cs="Calibri"/>
+          <w:color w:val="000000"/>
+        </w:rPr>
+        <w:br/>
+        <w:t>Live App:</w:t>
+      </w:r>
+      <w:hyperlink r:id="rId10" w:history="1">
+        <w:r>
+          <w:rPr>
+            <w:rStyle w:val="Hyperlink"/>
+            <w:rFonts w:ascii="Calibri" w:eastAsia="Calibri" w:hAnsi="Calibri" w:cs="Calibri"/>
+          </w:rPr>
+          <w:t>https://diabetes-risk-model-npibg7jed4gpfc277mjpjs.streamlit.app/</w:t>
+        </w:r>
+      </w:hyperlink>
+    </w:p>
+    <w:p>
+      <w:pPr>
+        <w:spacing w:before="140" w:after="20"/>
+      </w:pPr>
+      <w:r>
+        <w:rPr>
+          <w:rFonts w:ascii="Calibri" w:eastAsia="Calibri" w:hAnsi="Calibri" w:cs="Calibri"/>
+          <w:b/>
+          <w:bCs/>
+          <w:color w:val="000000"/>
+          <w:sz w:val="22"/>
+          <w:szCs w:val="22"/>
+        </w:rPr>
+        <w:lastRenderedPageBreak/>
+        <w:t>Employee Attrition Analysis</w:t>
+      </w:r>
+    </w:p>
+    <w:p>
+      <w:pPr>
         <w:spacing w:after="60"/>
         <w:ind w:left="200"/>
       </w:pPr>
@@ -621,7 +784,7 @@
           <w:rFonts w:ascii="Calibri" w:eastAsia="Calibri" w:hAnsi="Calibri" w:cs="Calibri"/>
           <w:color w:val="000000"/>
         </w:rPr>
-        <w:t>Type 2 diabetes screening model on 10,000 patient records; identified and removed 16 post-diagnosis (leakage) columns before modelling.</w:t>
+        <w:t>Statistical analysis (chi-square, t-tests) and four tuned classifiers on IBM's HR dataset (1,470 employees, 237 leavers), optimised for recall on the minority class.</w:t>
       </w:r>
     </w:p>
     <w:p>
@@ -643,7 +806,7 @@
           <w:rFonts w:ascii="Calibri" w:eastAsia="Calibri" w:hAnsi="Calibri" w:cs="Calibri"/>
           <w:color w:val="000000"/>
         </w:rPr>
-        <w:t>Python, pandas, XGBoost, SMOTE, Optuna, SHAP</w:t>
+        <w:t>Python, scikit-learn, SciPy</w:t>
       </w:r>
     </w:p>
     <w:p>
@@ -665,7 +828,78 @@
           <w:rFonts w:ascii="Calibri" w:eastAsia="Calibri" w:hAnsi="Calibri" w:cs="Calibri"/>
           <w:color w:val="000000"/>
         </w:rPr>
-        <w:t>Reduced a leakage-inflated 1.000 AUC to a clinically defensible model; github.com/kundaisemu</w:t>
+        <w:t>0.828 ROC-AUC</w:t>
+      </w:r>
+      <w:r>
+        <w:rPr>
+          <w:rFonts w:ascii="Calibri" w:eastAsia="Calibri" w:hAnsi="Calibri" w:cs="Calibri"/>
+          <w:color w:val="000000"/>
+        </w:rPr>
+        <w:br/>
+        <w:t xml:space="preserve">Live App: </w:t>
+      </w:r>
+      <w:hyperlink r:id="rId11" w:history="1">
+        <w:r>
+          <w:rPr>
+            <w:rStyle w:val="Hyperlink"/>
+            <w:rFonts w:ascii="Calibri" w:eastAsia="Calibri" w:hAnsi="Calibri" w:cs="Calibri"/>
+          </w:rPr>
+          <w:t>https://attrition-prediction-model-qt44rggygstz7w64ciuape.stre</w:t>
+        </w:r>
+        <w:r>
+          <w:rPr>
+            <w:rStyle w:val="Hyperlink"/>
+            <w:rFonts w:ascii="Calibri" w:eastAsia="Calibri" w:hAnsi="Calibri" w:cs="Calibri"/>
+          </w:rPr>
+          <w:t>a</w:t>
+        </w:r>
+        <w:r>
+          <w:rPr>
+            <w:rStyle w:val="Hyperlink"/>
+            <w:rFonts w:ascii="Calibri" w:eastAsia="Calibri" w:hAnsi="Calibri" w:cs="Calibri"/>
+          </w:rPr>
+          <w:t>mlit.app/</w:t>
+        </w:r>
+      </w:hyperlink>
+      <w:r>
+        <w:rPr>
+          <w:rFonts w:ascii="Calibri" w:eastAsia="Calibri" w:hAnsi="Calibri" w:cs="Calibri"/>
+          <w:color w:val="000000"/>
+        </w:rPr>
+        <w:br/>
+      </w:r>
+      <w:r>
+        <w:rPr>
+          <w:rFonts w:ascii="Calibri" w:eastAsia="Calibri" w:hAnsi="Calibri" w:cs="Calibri"/>
+          <w:color w:val="000000"/>
+        </w:rPr>
+        <w:t>Git</w:t>
+      </w:r>
+      <w:r>
+        <w:rPr>
+          <w:rFonts w:ascii="Calibri" w:eastAsia="Calibri" w:hAnsi="Calibri" w:cs="Calibri"/>
+          <w:color w:val="000000"/>
+        </w:rPr>
+        <w:t>Hub</w:t>
+      </w:r>
+      <w:r>
+        <w:rPr>
+          <w:rStyle w:val="Hyperlink"/>
+          <w:u w:val="none"/>
+        </w:rPr>
+        <w:t>:</w:t>
+      </w:r>
+      <w:r>
+        <w:rPr>
+          <w:rStyle w:val="Hyperlink"/>
+        </w:rPr>
+        <w:t xml:space="preserve"> </w:t>
+      </w:r>
+      <w:r>
+        <w:rPr>
+          <w:rStyle w:val="Hyperlink"/>
+        </w:rPr>
+        <w:t>https://github.com/kundai-nelly/attrition-prediction-model</w:t>
       </w:r>
     </w:p>
     <w:p>
@@ -681,8 +915,7 @@
           <w:sz w:val="22"/>
           <w:szCs w:val="22"/>
         </w:rPr>
-        <w:lastRenderedPageBreak/>
-        <w:t>Employee Attrition Analysis</w:t>
+        <w:t>Telecom Customer Churn Analysis</w:t>
       </w:r>
     </w:p>
     <w:p>
@@ -704,7 +937,7 @@
           <w:rFonts w:ascii="Calibri" w:eastAsia="Calibri" w:hAnsi="Calibri" w:cs="Calibri"/>
           <w:color w:val="000000"/>
         </w:rPr>
-        <w:t>Statistical analysis (chi-square, t-tests) and four tuned classifiers on IBM's HR dataset (1,470 employees, 237 leavers), optimised for recall on the minority class.</w:t>
+        <w:t>Hypothesis-test-driven analysis of 7,032 telecom customers, concluding in a specific retention recommendation rather than a leaderboard score.</w:t>
       </w:r>
     </w:p>
     <w:p>
@@ -726,7 +959,7 @@
           <w:rFonts w:ascii="Calibri" w:eastAsia="Calibri" w:hAnsi="Calibri" w:cs="Calibri"/>
           <w:color w:val="000000"/>
         </w:rPr>
-        <w:t>Python, scikit-learn, SciPy</w:t>
+        <w:t>Python, pandas, SciPy, logistic regression</w:t>
       </w:r>
     </w:p>
     <w:p>
@@ -748,7 +981,67 @@
           <w:rFonts w:ascii="Calibri" w:eastAsia="Calibri" w:hAnsi="Calibri" w:cs="Calibri"/>
           <w:color w:val="000000"/>
         </w:rPr>
-        <w:t>0.828 ROC-AUC; github.com/kundaisemu</w:t>
+        <w:t xml:space="preserve">Identified 26.6% churn rate and its key drivers; </w:t>
+      </w:r>
+      <w:r>
+        <w:rPr>
+          <w:rFonts w:ascii="Calibri" w:eastAsia="Calibri" w:hAnsi="Calibri" w:cs="Calibri"/>
+          <w:color w:val="000000"/>
+        </w:rPr>
+        <w:br/>
+      </w:r>
+      <w:r>
+        <w:rPr>
+          <w:rFonts w:ascii="Calibri" w:eastAsia="Calibri" w:hAnsi="Calibri" w:cs="Calibri"/>
+          <w:color w:val="000000"/>
+        </w:rPr>
+        <w:t>GitHub</w:t>
+      </w:r>
+      <w:r>
+        <w:rPr>
+          <w:rFonts w:ascii="Calibri" w:eastAsia="Calibri" w:hAnsi="Calibri" w:cs="Calibri"/>
+          <w:color w:val="000000"/>
+        </w:rPr>
+        <w:t xml:space="preserve">: </w:t>
+      </w:r>
+      <w:hyperlink r:id="rId12" w:history="1">
+        <w:r>
+          <w:rPr>
+            <w:rStyle w:val="Hyperlink"/>
+            <w:rFonts w:ascii="Calibri" w:eastAsia="Calibri" w:hAnsi="Calibri" w:cs="Calibri"/>
+          </w:rPr>
+          <w:t>https://github.com/kundai-nelly/kundai-nelly-Telecom_churn_analysis_project</w:t>
+        </w:r>
+      </w:hyperlink>
+      <w:r>
+        <w:rPr>
+          <w:rFonts w:ascii="Calibri" w:eastAsia="Calibri" w:hAnsi="Calibri" w:cs="Calibri"/>
+          <w:color w:val="000000"/>
+        </w:rPr>
+        <w:br/>
+      </w:r>
+      <w:r>
+        <w:rPr>
+          <w:rFonts w:ascii="Calibri" w:eastAsia="Calibri" w:hAnsi="Calibri" w:cs="Calibri"/>
+          <w:color w:val="000000"/>
+        </w:rPr>
+        <w:t>Live App</w:t>
+      </w:r>
+      <w:r>
+        <w:rPr>
+          <w:rFonts w:ascii="Calibri" w:eastAsia="Calibri" w:hAnsi="Calibri" w:cs="Calibri"/>
+          <w:color w:val="000000"/>
+        </w:rPr>
+        <w:t>:</w:t>
+      </w:r>
+      <w:r>
+        <w:t xml:space="preserve"> </w:t>
+      </w:r>
+      <w:r>
+        <w:rPr>
+          <w:rStyle w:val="Hyperlink"/>
+        </w:rPr>
+        <w:t>https://kundai-nelly-telecomchurnanalysisproject-zrpkjsmkyjd88zv87v7td.streamlit.app/</w:t>
       </w:r>
     </w:p>
     <w:p>
@@ -764,7 +1057,7 @@
           <w:sz w:val="22"/>
           <w:szCs w:val="22"/>
         </w:rPr>
-        <w:t>Telecom Customer Churn Analysis</w:t>
+        <w:t>Credit Risk Decision App</w:t>
       </w:r>
     </w:p>
     <w:p>
@@ -786,7 +1079,7 @@
           <w:rFonts w:ascii="Calibri" w:eastAsia="Calibri" w:hAnsi="Calibri" w:cs="Calibri"/>
           <w:color w:val="000000"/>
         </w:rPr>
-        <w:t>Hypothesis-test-driven analysis of 7,032 telecom customers, concluding in a specific retention recommendation rather than a leaderboard score.</w:t>
+        <w:t>Deployed credit decisioning tool where the risk threshold is a live, adjustable setting rather than a hard-coded cutoff.</w:t>
       </w:r>
     </w:p>
     <w:p>
@@ -808,13 +1101,17 @@
           <w:rFonts w:ascii="Calibri" w:eastAsia="Calibri" w:hAnsi="Calibri" w:cs="Calibri"/>
           <w:color w:val="000000"/>
         </w:rPr>
-        <w:t>Python, pandas, SciPy, logistic regression</w:t>
+        <w:t>Python, scikit-learn Pipeline, Streamlit</w:t>
       </w:r>
     </w:p>
     <w:p>
       <w:pPr>
         <w:spacing w:after="60"/>
         <w:ind w:left="200"/>
+        <w:rPr>
+          <w:rFonts w:ascii="Calibri" w:eastAsia="Calibri" w:hAnsi="Calibri" w:cs="Calibri"/>
+          <w:color w:val="000000"/>
+        </w:rPr>
       </w:pPr>
       <w:r>
         <w:rPr>
@@ -830,7 +1127,45 @@
           <w:rFonts w:ascii="Calibri" w:eastAsia="Calibri" w:hAnsi="Calibri" w:cs="Calibri"/>
           <w:color w:val="000000"/>
         </w:rPr>
-        <w:t>Identified 26.6% churn rate and its key drivers; github.com/kundaisemu</w:t>
+        <w:t>Live demo app</w:t>
+      </w:r>
+      <w:r>
+        <w:rPr>
+          <w:rFonts w:ascii="Calibri" w:eastAsia="Calibri" w:hAnsi="Calibri" w:cs="Calibri"/>
+          <w:color w:val="000000"/>
+        </w:rPr>
+        <w:t xml:space="preserve">: </w:t>
+      </w:r>
+      <w:r>
+        <w:rPr>
+          <w:rFonts w:ascii="Calibri" w:eastAsia="Calibri" w:hAnsi="Calibri" w:cs="Calibri"/>
+          <w:color w:val="000000"/>
+        </w:rPr>
+        <w:br/>
+        <w:t xml:space="preserve">GitHub: </w:t>
+      </w:r>
+      <w:hyperlink r:id="rId13" w:history="1">
+        <w:r>
+          <w:rPr>
+            <w:rStyle w:val="Hyperlink"/>
+            <w:rFonts w:ascii="Calibri" w:eastAsia="Calibri" w:hAnsi="Calibri" w:cs="Calibri"/>
+          </w:rPr>
+          <w:t>https://github.com/kundai-nelly/credit_risk_assessment_analysis_project</w:t>
+        </w:r>
+      </w:hyperlink>
+      <w:r>
+        <w:rPr>
+          <w:rFonts w:ascii="Calibri" w:eastAsia="Calibri" w:hAnsi="Calibri" w:cs="Calibri"/>
+          <w:color w:val="000000"/>
+        </w:rPr>
+        <w:br/>
+      </w:r>
+      <w:r>
+        <w:rPr>
+          <w:rFonts w:ascii="Calibri" w:eastAsia="Calibri" w:hAnsi="Calibri" w:cs="Calibri"/>
+          <w:color w:val="000000"/>
+        </w:rPr>
+        <w:t>Live App</w:t>
       </w:r>
     </w:p>
     <w:p>
@@ -846,7 +1181,7 @@
           <w:sz w:val="22"/>
           <w:szCs w:val="22"/>
         </w:rPr>
-        <w:t>Credit Risk Decision App</w:t>
+        <w:t>House Price Prediction (Regression &amp; Classification)</w:t>
       </w:r>
     </w:p>
     <w:p>
@@ -868,7 +1203,7 @@
           <w:rFonts w:ascii="Calibri" w:eastAsia="Calibri" w:hAnsi="Calibri" w:cs="Calibri"/>
           <w:color w:val="000000"/>
         </w:rPr>
-        <w:t>Deployed credit decisioning tool where the risk threshold is a live, adjustable setting rather than a hard-coded cutoff.</w:t>
+        <w:t>4,600 King County property records modelled both as price regression and as an above/below-median classification problem.</w:t>
       </w:r>
     </w:p>
     <w:p>
@@ -890,7 +1225,7 @@
           <w:rFonts w:ascii="Calibri" w:eastAsia="Calibri" w:hAnsi="Calibri" w:cs="Calibri"/>
           <w:color w:val="000000"/>
         </w:rPr>
-        <w:t>Python, scikit-learn Pipeline, Streamlit</w:t>
+        <w:t>Python, XGBoost, scikit-learn</w:t>
       </w:r>
     </w:p>
     <w:p>
@@ -912,7 +1247,85 @@
           <w:rFonts w:ascii="Calibri" w:eastAsia="Calibri" w:hAnsi="Calibri" w:cs="Calibri"/>
           <w:color w:val="000000"/>
         </w:rPr>
-        <w:t>Live demo app; github.com/kundaisemu</w:t>
+        <w:t>R² 0.786 (regression), 0.945 AUC (classification)</w:t>
+      </w:r>
+      <w:r>
+        <w:rPr>
+          <w:rFonts w:ascii="Calibri" w:eastAsia="Calibri" w:hAnsi="Calibri" w:cs="Calibri"/>
+          <w:color w:val="000000"/>
+        </w:rPr>
+        <w:br/>
+      </w:r>
+      <w:r>
+        <w:rPr>
+          <w:rFonts w:ascii="Calibri" w:eastAsia="Calibri" w:hAnsi="Calibri" w:cs="Calibri"/>
+          <w:color w:val="000000"/>
+        </w:rPr>
+        <w:t>GitHu</w:t>
+      </w:r>
+      <w:r>
+        <w:rPr>
+          <w:rFonts w:ascii="Calibri" w:eastAsia="Calibri" w:hAnsi="Calibri" w:cs="Calibri"/>
+          <w:color w:val="000000"/>
+        </w:rPr>
+        <w:t xml:space="preserve">b: </w:t>
+      </w:r>
+      <w:hyperlink r:id="rId14" w:history="1">
+        <w:r>
+          <w:rPr>
+            <w:rStyle w:val="Hyperlink"/>
+            <w:rFonts w:ascii="Calibri" w:eastAsia="Calibri" w:hAnsi="Calibri" w:cs="Calibri"/>
+          </w:rPr>
+          <w:t>https://github.com/kundai-nelly/house_price_prediction_analysis_project</w:t>
+        </w:r>
+      </w:hyperlink>
+      <w:r>
+        <w:rPr>
+          <w:rFonts w:ascii="Calibri" w:eastAsia="Calibri" w:hAnsi="Calibri" w:cs="Calibri"/>
+          <w:color w:val="000000"/>
+        </w:rPr>
+        <w:br/>
+      </w:r>
+      <w:r>
+        <w:rPr>
+          <w:rFonts w:ascii="Calibri" w:eastAsia="Calibri" w:hAnsi="Calibri" w:cs="Calibri"/>
+          <w:color w:val="000000"/>
+        </w:rPr>
+        <w:t>Live</w:t>
+      </w:r>
+      <w:r>
+        <w:rPr>
+          <w:rFonts w:ascii="Calibri" w:eastAsia="Calibri" w:hAnsi="Calibri" w:cs="Calibri"/>
+          <w:color w:val="000000"/>
+        </w:rPr>
+        <w:t xml:space="preserve"> </w:t>
+      </w:r>
+      <w:r>
+        <w:rPr>
+          <w:rFonts w:ascii="Calibri" w:eastAsia="Calibri" w:hAnsi="Calibri" w:cs="Calibri"/>
+          <w:color w:val="000000"/>
+        </w:rPr>
+        <w:t>App</w:t>
+      </w:r>
+      <w:r>
+        <w:rPr>
+          <w:rFonts w:ascii="Calibri" w:eastAsia="Calibri" w:hAnsi="Calibri" w:cs="Calibri"/>
+          <w:color w:val="000000"/>
+        </w:rPr>
+        <w:t>:</w:t>
+      </w:r>
+      <w:r>
+        <w:rPr>
+          <w:rFonts w:ascii="Calibri" w:eastAsia="Calibri" w:hAnsi="Calibri" w:cs="Calibri"/>
+          <w:color w:val="000000"/>
+        </w:rPr>
+        <w:t xml:space="preserve"> </w:t>
+      </w:r>
+      <w:r>
+        <w:rPr>
+          <w:rStyle w:val="Hyperlink"/>
+        </w:rPr>
+        <w:t>https://housepricepredictionanalysisproject-tndw68gmq9ehhcwmnprdxy.streamlit.app/</w:t>
       </w:r>
     </w:p>
     <w:p>
@@ -928,7 +1341,7 @@
           <w:sz w:val="22"/>
           <w:szCs w:val="22"/>
         </w:rPr>
-        <w:t>House Price Prediction (Regression &amp; Classification)</w:t>
+        <w:t>Event Calendar Application</w:t>
       </w:r>
     </w:p>
     <w:p>
@@ -950,7 +1363,7 @@
           <w:rFonts w:ascii="Calibri" w:eastAsia="Calibri" w:hAnsi="Calibri" w:cs="Calibri"/>
           <w:color w:val="000000"/>
         </w:rPr>
-        <w:t>4,600 King County property records modelled both as price regression and as an above/below-median classification problem.</w:t>
+        <w:t>Scheduling tool built first as a CLI to validate storage and logic, then rebuilt as a Streamlit dashboard.</w:t>
       </w:r>
     </w:p>
     <w:p>
@@ -972,7 +1385,7 @@
           <w:rFonts w:ascii="Calibri" w:eastAsia="Calibri" w:hAnsi="Calibri" w:cs="Calibri"/>
           <w:color w:val="000000"/>
         </w:rPr>
-        <w:t>Python, XGBoost, scikit-learn</w:t>
+        <w:t>Python, Streamlit, Plotly, JSON storage</w:t>
       </w:r>
     </w:p>
     <w:p>
@@ -994,89 +1407,64 @@
           <w:rFonts w:ascii="Calibri" w:eastAsia="Calibri" w:hAnsi="Calibri" w:cs="Calibri"/>
           <w:color w:val="000000"/>
         </w:rPr>
-        <w:t>R² 0.786 (regression), 0.945 AUC (classification); github.com/kundaisemu</w:t>
-      </w:r>
-    </w:p>
-    <w:p>
-      <w:pPr>
-        <w:spacing w:before="140" w:after="20"/>
-      </w:pPr>
-      <w:r>
-        <w:rPr>
-          <w:rFonts w:ascii="Calibri" w:eastAsia="Calibri" w:hAnsi="Calibri" w:cs="Calibri"/>
-          <w:b/>
-          <w:bCs/>
-          <w:color w:val="000000"/>
-          <w:sz w:val="22"/>
-          <w:szCs w:val="22"/>
-        </w:rPr>
-        <w:t>Event Calendar Application</w:t>
-      </w:r>
-    </w:p>
-    <w:p>
-      <w:pPr>
-        <w:spacing w:after="60"/>
-        <w:ind w:left="200"/>
-      </w:pPr>
-      <w:r>
-        <w:rPr>
-          <w:rFonts w:ascii="Calibri" w:eastAsia="Calibri" w:hAnsi="Calibri" w:cs="Calibri"/>
-          <w:i/>
-          <w:iCs/>
-          <w:color w:val="444444"/>
-        </w:rPr>
-        <w:t xml:space="preserve">Description &amp; Architecture: </w:t>
-      </w:r>
-      <w:r>
-        <w:rPr>
-          <w:rFonts w:ascii="Calibri" w:eastAsia="Calibri" w:hAnsi="Calibri" w:cs="Calibri"/>
-          <w:color w:val="000000"/>
-        </w:rPr>
-        <w:t>Scheduling tool built first as a CLI to validate storage and logic, then rebuilt as a Streamlit dashboard.</w:t>
-      </w:r>
-    </w:p>
-    <w:p>
-      <w:pPr>
-        <w:spacing w:after="60"/>
-        <w:ind w:left="200"/>
-      </w:pPr>
-      <w:r>
-        <w:rPr>
-          <w:rFonts w:ascii="Calibri" w:eastAsia="Calibri" w:hAnsi="Calibri" w:cs="Calibri"/>
-          <w:i/>
-          <w:iCs/>
-          <w:color w:val="444444"/>
-        </w:rPr>
-        <w:t xml:space="preserve">Core Tech Used: </w:t>
-      </w:r>
-      <w:r>
-        <w:rPr>
-          <w:rFonts w:ascii="Calibri" w:eastAsia="Calibri" w:hAnsi="Calibri" w:cs="Calibri"/>
-          <w:color w:val="000000"/>
-        </w:rPr>
-        <w:t>Python, Streamlit, Plotly, JSON storage</w:t>
-      </w:r>
-    </w:p>
-    <w:p>
-      <w:pPr>
-        <w:spacing w:after="60"/>
-        <w:ind w:left="200"/>
-      </w:pPr>
-      <w:r>
-        <w:rPr>
-          <w:rFonts w:ascii="Calibri" w:eastAsia="Calibri" w:hAnsi="Calibri" w:cs="Calibri"/>
-          <w:i/>
-          <w:iCs/>
-          <w:color w:val="444444"/>
-        </w:rPr>
-        <w:t xml:space="preserve">Direct Outcome: </w:t>
-      </w:r>
-      <w:r>
-        <w:rPr>
-          <w:rFonts w:ascii="Calibri" w:eastAsia="Calibri" w:hAnsi="Calibri" w:cs="Calibri"/>
-          <w:color w:val="000000"/>
-        </w:rPr>
-        <w:t>CSV export and working demo; github.com/kundaisemu</w:t>
+        <w:t>CSV export and working demo</w:t>
+      </w:r>
+      <w:r>
+        <w:rPr>
+          <w:rFonts w:ascii="Calibri" w:eastAsia="Calibri" w:hAnsi="Calibri" w:cs="Calibri"/>
+          <w:color w:val="000000"/>
+        </w:rPr>
+        <w:t xml:space="preserve"> </w:t>
+      </w:r>
+      <w:r>
+        <w:rPr>
+          <w:rFonts w:ascii="Calibri" w:eastAsia="Calibri" w:hAnsi="Calibri" w:cs="Calibri"/>
+          <w:color w:val="000000"/>
+        </w:rPr>
+        <w:br/>
+      </w:r>
+      <w:r>
+        <w:rPr>
+          <w:rFonts w:ascii="Calibri" w:eastAsia="Calibri" w:hAnsi="Calibri" w:cs="Calibri"/>
+          <w:color w:val="000000"/>
+        </w:rPr>
+        <w:t xml:space="preserve">GitHub: </w:t>
+      </w:r>
+      <w:hyperlink r:id="rId15" w:history="1">
+        <w:r>
+          <w:rPr>
+            <w:rStyle w:val="Hyperlink"/>
+            <w:rFonts w:ascii="Calibri" w:eastAsia="Calibri" w:hAnsi="Calibri" w:cs="Calibri"/>
+          </w:rPr>
+          <w:t>https://github.com/kundai-nelly/event-calendar-app</w:t>
+        </w:r>
+      </w:hyperlink>
+      <w:r>
+        <w:rPr>
+          <w:rFonts w:ascii="Calibri" w:eastAsia="Calibri" w:hAnsi="Calibri" w:cs="Calibri"/>
+          <w:color w:val="000000"/>
+        </w:rPr>
+        <w:br/>
+      </w:r>
+      <w:r>
+        <w:rPr>
+          <w:rFonts w:ascii="Calibri" w:eastAsia="Calibri" w:hAnsi="Calibri" w:cs="Calibri"/>
+          <w:color w:val="000000"/>
+        </w:rPr>
+        <w:t>Live App:</w:t>
+      </w:r>
+      <w:r>
+        <w:rPr>
+          <w:rFonts w:ascii="Calibri" w:eastAsia="Calibri" w:hAnsi="Calibri" w:cs="Calibri"/>
+          <w:color w:val="000000"/>
+        </w:rPr>
+        <w:t xml:space="preserve"> </w:t>
+      </w:r>
+      <w:r>
+        <w:rPr>
+          <w:rStyle w:val="Hyperlink"/>
+        </w:rPr>
+        <w:t>https://event-calendar-app-cycxgd5gl3u3gx83tweikt.streamlit.app/</w:t>
       </w:r>
     </w:p>
     <w:p>
@@ -1140,7 +1528,6 @@
           <w:ilvl w:val="0"/>
           <w:numId w:val="3"/>
         </w:numPr>
-        <w:spacing w:after="100"/>
       </w:pPr>
       <w:r>
         <w:t>Data Analyst</w:t>
@@ -1153,7 +1540,6 @@
           <w:ilvl w:val="0"/>
           <w:numId w:val="3"/>
         </w:numPr>
-        <w:spacing w:after="100"/>
       </w:pPr>
       <w:r>
         <w:t xml:space="preserve"> ICT System Analyst</w:t>
@@ -1166,7 +1552,6 @@
           <w:ilvl w:val="0"/>
           <w:numId w:val="3"/>
         </w:numPr>
-        <w:spacing w:after="100"/>
       </w:pPr>
       <w:r>
         <w:t>Computer Network and Systems Engineer</w:t>
@@ -1179,7 +1564,6 @@
           <w:ilvl w:val="0"/>
           <w:numId w:val="3"/>
         </w:numPr>
-        <w:spacing w:after="100"/>
       </w:pPr>
       <w:r>
         <w:t>Network Analyst.</w:t>

</xml_diff>

<commit_message>
Update CV to refine professional summary and enhance project descriptions with additional technologies and links
</commit_message>
<xml_diff>
--- a/Kundai_Nelly_Semu_CV.docx
+++ b/Kundai_Nelly_Semu_CV.docx
@@ -34,30 +34,14 @@
           <w:rFonts w:ascii="Calibri" w:eastAsia="Calibri" w:hAnsi="Calibri" w:cs="Calibri"/>
           <w:color w:val="444444"/>
         </w:rPr>
-        <w:t xml:space="preserve">Africa </w:t>
-      </w:r>
-      <w:proofErr w:type="gramStart"/>
-      <w:r>
-        <w:rPr>
-          <w:rFonts w:ascii="Calibri" w:eastAsia="Calibri" w:hAnsi="Calibri" w:cs="Calibri"/>
-          <w:color w:val="444444"/>
-        </w:rPr>
-        <w:t>|</w:t>
-      </w:r>
-      <w:r>
-        <w:rPr>
-          <w:rFonts w:ascii="Calibri" w:eastAsia="Calibri" w:hAnsi="Calibri" w:cs="Calibri"/>
-          <w:color w:val="444444"/>
-        </w:rPr>
-        <w:t xml:space="preserve">  +</w:t>
-      </w:r>
-      <w:proofErr w:type="gramEnd"/>
-      <w:r>
-        <w:rPr>
-          <w:rFonts w:ascii="Calibri" w:eastAsia="Calibri" w:hAnsi="Calibri" w:cs="Calibri"/>
-          <w:color w:val="444444"/>
-        </w:rPr>
-        <w:t xml:space="preserve">27 67 144 </w:t>
+        <w:t>Africa |</w:t>
+      </w:r>
+      <w:r>
+        <w:rPr>
+          <w:rFonts w:ascii="Calibri" w:eastAsia="Calibri" w:hAnsi="Calibri" w:cs="Calibri"/>
+          <w:color w:val="444444"/>
+        </w:rPr>
+        <w:t xml:space="preserve">  +27 67 144 </w:t>
       </w:r>
       <w:r>
         <w:rPr>
@@ -189,16 +173,7 @@
           <w:sz w:val="22"/>
           <w:szCs w:val="22"/>
         </w:rPr>
-        <w:t xml:space="preserve">Systems engineer and data analyst based in Harare, with a background spanning database administration, business intelligence and applied machine learning. Core stack of Python, SQL, scikit-learn and XGBoost, with production experience keeping MySQL/PostgreSQL databases and Windows/Linux server estates running. Has independently built and shipped six end-to-end data science projects, from raw data through statistical validation to deployed Streamlit applications. Looking for data analyst, data scientist, or </w:t>
-      </w:r>
-      <w:r>
-        <w:rPr>
-          <w:rFonts w:ascii="Calibri" w:eastAsia="Calibri" w:hAnsi="Calibri" w:cs="Calibri"/>
-          <w:color w:val="000000"/>
-          <w:sz w:val="22"/>
-          <w:szCs w:val="22"/>
-        </w:rPr>
-        <w:t>data-oriented systems roles.</w:t>
+        <w:t>Systems engineer and data analyst with a background spanning database administration, business intelligence and applied machine learning. Core stack of Python, SQL, scikit-learn and XGBoost, with production experience keeping MySQL/PostgreSQL databases and Windows/Linux server estates running. Has independently built and shipped six end-to-end data science projects, from raw data through statistical validation to deployed Streamlit applications. Looking for data analyst, data scientist, or data-oriented systems roles.</w:t>
       </w:r>
     </w:p>
     <w:p>
@@ -684,6 +659,13 @@
           <w:color w:val="000000"/>
         </w:rPr>
         <w:t>Python, pandas, XGBoost, SMOTE, Optuna, SHAP</w:t>
+      </w:r>
+      <w:r>
+        <w:rPr>
+          <w:rFonts w:ascii="Calibri" w:eastAsia="Calibri" w:hAnsi="Calibri" w:cs="Calibri"/>
+          <w:color w:val="000000"/>
+        </w:rPr>
+        <w:t>, Streamlit</w:t>
       </w:r>
     </w:p>
     <w:p>
@@ -808,6 +790,20 @@
         </w:rPr>
         <w:t>Python, scikit-learn, SciPy</w:t>
       </w:r>
+      <w:r>
+        <w:rPr>
+          <w:rFonts w:ascii="Calibri" w:eastAsia="Calibri" w:hAnsi="Calibri" w:cs="Calibri"/>
+          <w:color w:val="000000"/>
+        </w:rPr>
+        <w:t>, S</w:t>
+      </w:r>
+      <w:r>
+        <w:rPr>
+          <w:rFonts w:ascii="Calibri" w:eastAsia="Calibri" w:hAnsi="Calibri" w:cs="Calibri"/>
+          <w:color w:val="000000"/>
+        </w:rPr>
+        <w:t>treamlit</w:t>
+      </w:r>
     </w:p>
     <w:p>
       <w:pPr>
@@ -829,6 +825,39 @@
           <w:color w:val="000000"/>
         </w:rPr>
         <w:t>0.828 ROC-AUC</w:t>
+      </w:r>
+      <w:r>
+        <w:rPr>
+          <w:rFonts w:ascii="Calibri" w:eastAsia="Calibri" w:hAnsi="Calibri" w:cs="Calibri"/>
+          <w:color w:val="000000"/>
+        </w:rPr>
+        <w:br/>
+      </w:r>
+      <w:r>
+        <w:rPr>
+          <w:rFonts w:ascii="Calibri" w:eastAsia="Calibri" w:hAnsi="Calibri" w:cs="Calibri"/>
+          <w:color w:val="000000"/>
+        </w:rPr>
+        <w:t>GitHub</w:t>
+      </w:r>
+      <w:r>
+        <w:rPr>
+          <w:rStyle w:val="Hyperlink"/>
+          <w:u w:val="none"/>
+        </w:rPr>
+        <w:t>:</w:t>
+      </w:r>
+      <w:r>
+        <w:rPr>
+          <w:rStyle w:val="Hyperlink"/>
+        </w:rPr>
+        <w:t xml:space="preserve"> </w:t>
+      </w:r>
+      <w:r>
+        <w:rPr>
+          <w:rStyle w:val="Hyperlink"/>
+        </w:rPr>
+        <w:t>https://github.com/kundai-nelly/attrition-prediction-model</w:t>
       </w:r>
       <w:r>
         <w:rPr>
@@ -844,63 +873,9 @@
             <w:rStyle w:val="Hyperlink"/>
             <w:rFonts w:ascii="Calibri" w:eastAsia="Calibri" w:hAnsi="Calibri" w:cs="Calibri"/>
           </w:rPr>
-          <w:t>https://attrition-prediction-model-qt44rggygstz7w64ciuape.stre</w:t>
-        </w:r>
-        <w:r>
-          <w:rPr>
-            <w:rStyle w:val="Hyperlink"/>
-            <w:rFonts w:ascii="Calibri" w:eastAsia="Calibri" w:hAnsi="Calibri" w:cs="Calibri"/>
-          </w:rPr>
-          <w:t>a</w:t>
-        </w:r>
-        <w:r>
-          <w:rPr>
-            <w:rStyle w:val="Hyperlink"/>
-            <w:rFonts w:ascii="Calibri" w:eastAsia="Calibri" w:hAnsi="Calibri" w:cs="Calibri"/>
-          </w:rPr>
-          <w:t>mlit.app/</w:t>
+          <w:t>https://attrition-prediction-model-qt44rggygstz7w64ciuape.streamlit.app/</w:t>
         </w:r>
       </w:hyperlink>
-      <w:r>
-        <w:rPr>
-          <w:rFonts w:ascii="Calibri" w:eastAsia="Calibri" w:hAnsi="Calibri" w:cs="Calibri"/>
-          <w:color w:val="000000"/>
-        </w:rPr>
-        <w:br/>
-      </w:r>
-      <w:r>
-        <w:rPr>
-          <w:rFonts w:ascii="Calibri" w:eastAsia="Calibri" w:hAnsi="Calibri" w:cs="Calibri"/>
-          <w:color w:val="000000"/>
-        </w:rPr>
-        <w:t>Git</w:t>
-      </w:r>
-      <w:r>
-        <w:rPr>
-          <w:rFonts w:ascii="Calibri" w:eastAsia="Calibri" w:hAnsi="Calibri" w:cs="Calibri"/>
-          <w:color w:val="000000"/>
-        </w:rPr>
-        <w:t>Hub</w:t>
-      </w:r>
-      <w:r>
-        <w:rPr>
-          <w:rStyle w:val="Hyperlink"/>
-          <w:u w:val="none"/>
-        </w:rPr>
-        <w:t>:</w:t>
-      </w:r>
-      <w:r>
-        <w:rPr>
-          <w:rStyle w:val="Hyperlink"/>
-        </w:rPr>
-        <w:t xml:space="preserve"> </w:t>
-      </w:r>
-      <w:r>
-        <w:rPr>
-          <w:rStyle w:val="Hyperlink"/>
-        </w:rPr>
-        <w:t>https://github.com/kundai-nelly/attrition-prediction-model</w:t>
-      </w:r>
     </w:p>
     <w:p>
       <w:pPr>
@@ -960,6 +935,13 @@
           <w:color w:val="000000"/>
         </w:rPr>
         <w:t>Python, pandas, SciPy, logistic regression</w:t>
+      </w:r>
+      <w:r>
+        <w:rPr>
+          <w:rFonts w:ascii="Calibri" w:eastAsia="Calibri" w:hAnsi="Calibri" w:cs="Calibri"/>
+          <w:color w:val="000000"/>
+        </w:rPr>
+        <w:t>, Streamlit</w:t>
       </w:r>
     </w:p>
     <w:p>
@@ -1227,6 +1209,13 @@
         </w:rPr>
         <w:t>Python, XGBoost, scikit-learn</w:t>
       </w:r>
+      <w:r>
+        <w:rPr>
+          <w:rFonts w:ascii="Calibri" w:eastAsia="Calibri" w:hAnsi="Calibri" w:cs="Calibri"/>
+          <w:color w:val="000000"/>
+        </w:rPr>
+        <w:t>, Streamlit</w:t>
+      </w:r>
     </w:p>
     <w:p>
       <w:pPr>
@@ -1407,14 +1396,7 @@
           <w:rFonts w:ascii="Calibri" w:eastAsia="Calibri" w:hAnsi="Calibri" w:cs="Calibri"/>
           <w:color w:val="000000"/>
         </w:rPr>
-        <w:t>CSV export and working demo</w:t>
-      </w:r>
-      <w:r>
-        <w:rPr>
-          <w:rFonts w:ascii="Calibri" w:eastAsia="Calibri" w:hAnsi="Calibri" w:cs="Calibri"/>
-          <w:color w:val="000000"/>
-        </w:rPr>
-        <w:t xml:space="preserve"> </w:t>
+        <w:t xml:space="preserve">CSV export and working demo </w:t>
       </w:r>
       <w:r>
         <w:rPr>

</xml_diff>